<commit_message>
making changes to brick frag
</commit_message>
<xml_diff>
--- a/Final Paper.docx
+++ b/Final Paper.docx
@@ -231,7 +231,19 @@
         <w:rPr>
           <w:lang w:val="en-US"/>
         </w:rPr>
-        <w:t xml:space="preserve"> graphically expensive for the hardware available.</w:t>
+        <w:t xml:space="preserve"> graphically expensive for the hardware available</w:t>
+      </w:r>
+      <w:r>
+        <w:rPr>
+          <w:lang w:val="en-US"/>
+        </w:rPr>
+        <w:t xml:space="preserve"> to run at acceptable framerates</w:t>
+      </w:r>
+      <w:r>
+        <w:rPr>
+          <w:lang w:val="en-US"/>
+        </w:rPr>
+        <w:t>.</w:t>
       </w:r>
       <w:r>
         <w:rPr>
@@ -252,14 +264,12 @@
         </w:rPr>
         <w:t xml:space="preserve">Several other methods were used to enhance the performance of the game. The first was to pre render the voxels used to build the brick fragments already on initialization of the walls (at the beginning of the game), so that they would not need to be </w:t>
       </w:r>
-      <w:proofErr w:type="spellStart"/>
-      <w:r>
-        <w:rPr>
-          <w:lang w:val="en-US"/>
-        </w:rPr>
-        <w:t>intialised</w:t>
-      </w:r>
-      <w:proofErr w:type="spellEnd"/>
+      <w:r>
+        <w:rPr>
+          <w:lang w:val="en-US"/>
+        </w:rPr>
+        <w:t>initialized</w:t>
+      </w:r>
       <w:r>
         <w:rPr>
           <w:lang w:val="en-US"/>
@@ -390,31 +400,25 @@
           <w:lang w:val="en-US"/>
         </w:rPr>
         <w:lastRenderedPageBreak/>
-        <w:t>bounding boxes to check for the point at which</w:t>
-      </w:r>
-      <w:r>
-        <w:rPr>
-          <w:lang w:val="en-US"/>
-        </w:rPr>
-        <w:t xml:space="preserve"> all</w:t>
-      </w:r>
-      <w:r>
-        <w:rPr>
-          <w:lang w:val="en-US"/>
-        </w:rPr>
-        <w:t xml:space="preserve"> the</w:t>
-      </w:r>
-      <w:r>
-        <w:rPr>
-          <w:lang w:val="en-US"/>
-        </w:rPr>
-        <w:t>se</w:t>
-      </w:r>
-      <w:r>
-        <w:rPr>
-          <w:lang w:val="en-US"/>
-        </w:rPr>
-        <w:t xml:space="preserve"> fracture lines intersect the sides of the brick.</w:t>
+        <w:t xml:space="preserve">bounding boxes to </w:t>
+      </w:r>
+      <w:r>
+        <w:rPr>
+          <w:lang w:val="en-US"/>
+        </w:rPr>
+        <w:t>calculate</w:t>
+      </w:r>
+      <w:r>
+        <w:rPr>
+          <w:lang w:val="en-US"/>
+        </w:rPr>
+        <w:t xml:space="preserve"> </w:t>
+      </w:r>
+      <w:r>
+        <w:rPr>
+          <w:lang w:val="en-US"/>
+        </w:rPr>
+        <w:t>the intersection points of all these fracture lines with the sides of the brick, to determine the length of the lines.</w:t>
       </w:r>
     </w:p>
     <w:p>
@@ -539,7 +543,31 @@
         <w:rPr>
           <w:lang w:val="en-US"/>
         </w:rPr>
-        <w:t xml:space="preserve"> when the ball collides with a brick, groups of adjacent voxels are combined into fragments in dynamic and random ways. This is done by </w:t>
+        <w:t xml:space="preserve"> </w:t>
+      </w:r>
+      <w:r>
+        <w:rPr>
+          <w:lang w:val="en-US"/>
+        </w:rPr>
+        <w:t>of impact between the ball and a brick</w:t>
+      </w:r>
+      <w:r>
+        <w:rPr>
+          <w:lang w:val="en-US"/>
+        </w:rPr>
+        <w:t xml:space="preserve">, </w:t>
+      </w:r>
+      <w:r>
+        <w:rPr>
+          <w:lang w:val="en-US"/>
+        </w:rPr>
+        <w:t>the voxels within the brick are divided into groups to create fragments</w:t>
+      </w:r>
+      <w:r>
+        <w:rPr>
+          <w:lang w:val="en-US"/>
+        </w:rPr>
+        <w:t xml:space="preserve">. This is done by </w:t>
       </w:r>
       <w:r>
         <w:rPr>
@@ -605,33 +633,7 @@
         <w:rPr>
           <w:lang w:val="en-US"/>
         </w:rPr>
-        <w:t xml:space="preserve"> if that voxel has not yet been grouped into a fragment, it generates a random </w:t>
-      </w:r>
-      <w:proofErr w:type="gramStart"/>
-      <w:r>
-        <w:rPr>
-          <w:lang w:val="en-US"/>
-        </w:rPr>
-        <w:t xml:space="preserve">integer </w:t>
-      </w:r>
-      <w:r>
-        <w:rPr>
-          <w:lang w:val="en-US"/>
-        </w:rPr>
-        <w:t xml:space="preserve"> </w:t>
-      </w:r>
-      <w:r>
-        <w:rPr>
-          <w:lang w:val="en-US"/>
-        </w:rPr>
-        <w:t>in</w:t>
-      </w:r>
-      <w:proofErr w:type="gramEnd"/>
-      <w:r>
-        <w:rPr>
-          <w:lang w:val="en-US"/>
-        </w:rPr>
-        <w:t xml:space="preserve">  the range from one to a number that is divided by a fragment size multiplier (we chose 0.2) and multiplied by the magnitude of the velocity of the ball at impact. </w:t>
+        <w:t xml:space="preserve"> if that voxel has not yet been grouped into a fragment, it generates a random integer in the range from one to a number that is divided by a fragment size multiplier (we chose 0.2) and multiplied by the magnitude of the velocity of the ball at impact. </w:t>
       </w:r>
       <w:r>
         <w:rPr>
@@ -659,19 +661,38 @@
           <w:lang w:val="en-US"/>
         </w:rPr>
       </w:pPr>
-      <w:r>
-        <w:rPr>
-          <w:lang w:val="en-US"/>
-        </w:rPr>
-        <w:t>Pseudo Code:</w:t>
-      </w:r>
-    </w:p>
-    <w:p>
-      <w:pPr>
-        <w:rPr>
-          <w:lang w:val="en-US"/>
-        </w:rPr>
-      </w:pPr>
+    </w:p>
+    <w:p>
+      <w:pPr>
+        <w:rPr>
+          <w:lang w:val="en-US"/>
+        </w:rPr>
+      </w:pPr>
+      <w:r>
+        <w:rPr>
+          <w:lang w:val="en-US"/>
+        </w:rPr>
+        <w:t>Fracture Line Creation:</w:t>
+      </w:r>
+      <w:r>
+        <w:rPr>
+          <w:lang w:val="en-US"/>
+        </w:rPr>
+        <w:tab/>
+      </w:r>
+    </w:p>
+    <w:p>
+      <w:pPr>
+        <w:rPr>
+          <w:lang w:val="en-US"/>
+        </w:rPr>
+      </w:pPr>
+      <w:r>
+        <w:rPr>
+          <w:lang w:val="en-US"/>
+        </w:rPr>
+        <w:tab/>
+      </w:r>
     </w:p>
     <w:sectPr>
       <w:pgSz w:w="11906" w:h="16838"/>

</xml_diff>

<commit_message>
even more work on project paper
</commit_message>
<xml_diff>
--- a/Final Paper.docx
+++ b/Final Paper.docx
@@ -109,26 +109,68 @@
         <w:rPr>
           <w:lang w:val="en-US"/>
         </w:rPr>
-        <w:t>The player moves in two dimensions instead of the single dimension of movement for the paddle in the original game, and can catch and throw the ball instead of merely deflecting it as in the original games.</w:t>
-      </w:r>
-    </w:p>
-    <w:p>
-      <w:pPr>
-        <w:rPr>
-          <w:lang w:val="en-US"/>
-        </w:rPr>
-      </w:pPr>
-      <w:r>
-        <w:rPr>
-          <w:lang w:val="en-US"/>
-        </w:rPr>
-        <w:t xml:space="preserve">In the game, the player plays the part of the paddle under the bricks in the original games (as if looking up at the bricks needed to be broken). The player has to break all the bricks before time runs out or he runs out of balls. </w:t>
-      </w:r>
-      <w:r>
-        <w:rPr>
-          <w:lang w:val="en-US"/>
-        </w:rPr>
-        <w:t xml:space="preserve">They start by throwing the ball, and then the same ball can be caught with either of the in-game hands and rethrown, or can be hit with a racket held in either hand. Furthermore, the player tries to collect points along the way by catching the fragments of bricks they destroy. The game also features several powerups that manipulate the game in several ways (moving the brick walls, </w:t>
+        <w:t xml:space="preserve">The player moves in two dimensions instead of the single dimension of movement for the paddle in the original </w:t>
+      </w:r>
+      <w:proofErr w:type="gramStart"/>
+      <w:r>
+        <w:rPr>
+          <w:lang w:val="en-US"/>
+        </w:rPr>
+        <w:t>game, and</w:t>
+      </w:r>
+      <w:proofErr w:type="gramEnd"/>
+      <w:r>
+        <w:rPr>
+          <w:lang w:val="en-US"/>
+        </w:rPr>
+        <w:t xml:space="preserve"> can catch and throw the ball instead of merely deflecting it as in the original games.</w:t>
+      </w:r>
+    </w:p>
+    <w:p>
+      <w:pPr>
+        <w:rPr>
+          <w:lang w:val="en-US"/>
+        </w:rPr>
+      </w:pPr>
+      <w:r>
+        <w:rPr>
+          <w:lang w:val="en-US"/>
+        </w:rPr>
+        <w:t xml:space="preserve">In the game, the player plays the part of the paddle under the bricks in the original games (as if looking up at the bricks needed to be broken). The player </w:t>
+      </w:r>
+      <w:proofErr w:type="gramStart"/>
+      <w:r>
+        <w:rPr>
+          <w:lang w:val="en-US"/>
+        </w:rPr>
+        <w:t>has to</w:t>
+      </w:r>
+      <w:proofErr w:type="gramEnd"/>
+      <w:r>
+        <w:rPr>
+          <w:lang w:val="en-US"/>
+        </w:rPr>
+        <w:t xml:space="preserve"> break all the bricks before time runs out or he runs out of balls. </w:t>
+      </w:r>
+      <w:r>
+        <w:rPr>
+          <w:lang w:val="en-US"/>
+        </w:rPr>
+        <w:t xml:space="preserve">They start by throwing the ball, and then the same ball can be caught with either of the in-game hands and </w:t>
+      </w:r>
+      <w:proofErr w:type="gramStart"/>
+      <w:r>
+        <w:rPr>
+          <w:lang w:val="en-US"/>
+        </w:rPr>
+        <w:t>rethrown, or</w:t>
+      </w:r>
+      <w:proofErr w:type="gramEnd"/>
+      <w:r>
+        <w:rPr>
+          <w:lang w:val="en-US"/>
+        </w:rPr>
+        <w:t xml:space="preserve"> can be hit with a racket held in either hand. Furthermore, the player tries to collect points along the way by catching the fragments of bricks they destroy. The game also features several powerups that manipulate the game in several ways (moving the brick walls, </w:t>
       </w:r>
       <w:r>
         <w:rPr>
@@ -323,7 +365,21 @@
         <w:rPr>
           <w:lang w:val="en-US"/>
         </w:rPr>
-        <w:t>If the negative powerup is active at the same time, than the player loses double points.</w:t>
+        <w:t xml:space="preserve">If the negative powerup is active at the same time, </w:t>
+      </w:r>
+      <w:proofErr w:type="gramStart"/>
+      <w:r>
+        <w:rPr>
+          <w:lang w:val="en-US"/>
+        </w:rPr>
+        <w:t>than</w:t>
+      </w:r>
+      <w:proofErr w:type="gramEnd"/>
+      <w:r>
+        <w:rPr>
+          <w:lang w:val="en-US"/>
+        </w:rPr>
+        <w:t xml:space="preserve"> the player loses double points.</w:t>
       </w:r>
     </w:p>
     <w:p>
@@ -732,7 +788,15 @@
         <w:t>In addition, the p</w:t>
       </w:r>
       <w:r>
-        <w:t>layer has two axis of movement (up/down and left/right)</w:t>
+        <w:t xml:space="preserve">layer has two </w:t>
+      </w:r>
+      <w:proofErr w:type="gramStart"/>
+      <w:r>
+        <w:t>axis</w:t>
+      </w:r>
+      <w:proofErr w:type="gramEnd"/>
+      <w:r>
+        <w:t xml:space="preserve"> of movement (up/down and left/right)</w:t>
       </w:r>
       <w:r>
         <w:rPr>
@@ -830,6 +894,76 @@
     </w:p>
     <w:p>
       <w:pPr>
+        <w:rPr>
+          <w:lang w:val="en-US"/>
+        </w:rPr>
+      </w:pPr>
+    </w:p>
+    <w:p>
+      <w:pPr>
+        <w:rPr>
+          <w:lang w:val="en-US"/>
+        </w:rPr>
+      </w:pPr>
+    </w:p>
+    <w:p>
+      <w:pPr>
+        <w:rPr>
+          <w:lang w:val="en-US"/>
+        </w:rPr>
+      </w:pPr>
+    </w:p>
+    <w:p>
+      <w:pPr>
+        <w:rPr>
+          <w:lang w:val="en-US"/>
+        </w:rPr>
+      </w:pPr>
+    </w:p>
+    <w:p>
+      <w:pPr>
+        <w:rPr>
+          <w:lang w:val="en-US"/>
+        </w:rPr>
+      </w:pPr>
+    </w:p>
+    <w:p>
+      <w:pPr>
+        <w:rPr>
+          <w:lang w:val="en-US"/>
+        </w:rPr>
+      </w:pPr>
+    </w:p>
+    <w:p>
+      <w:pPr>
+        <w:rPr>
+          <w:lang w:val="en-US"/>
+        </w:rPr>
+      </w:pPr>
+    </w:p>
+    <w:p>
+      <w:pPr>
+        <w:rPr>
+          <w:lang w:val="en-US"/>
+        </w:rPr>
+      </w:pPr>
+    </w:p>
+    <w:p>
+      <w:pPr>
+        <w:rPr>
+          <w:lang w:val="en-US"/>
+        </w:rPr>
+      </w:pPr>
+    </w:p>
+    <w:p>
+      <w:pPr>
+        <w:rPr>
+          <w:lang w:val="en-US"/>
+        </w:rPr>
+      </w:pPr>
+    </w:p>
+    <w:p>
+      <w:pPr>
         <w:pStyle w:val="Heading1"/>
         <w:rPr>
           <w:lang w:val="en-US"/>
@@ -839,6 +973,1127 @@
         <w:rPr>
           <w:lang w:val="en-US"/>
         </w:rPr>
+        <w:t>Application Overview</w:t>
+      </w:r>
+    </w:p>
+    <w:p>
+      <w:pPr>
+        <w:pStyle w:val="Heading3"/>
+        <w:rPr>
+          <w:lang w:val="en-US"/>
+        </w:rPr>
+      </w:pPr>
+      <w:r>
+        <w:rPr>
+          <w:lang w:val="en-US"/>
+        </w:rPr>
+        <w:t>Main Menu</w:t>
+      </w:r>
+      <w:r>
+        <w:rPr>
+          <w:lang w:val="en-US"/>
+        </w:rPr>
+        <w:t xml:space="preserve"> (OPening menu)</w:t>
+      </w:r>
+    </w:p>
+    <w:p>
+      <w:pPr>
+        <w:jc w:val="center"/>
+        <w:rPr>
+          <w:lang w:val="en-US"/>
+        </w:rPr>
+      </w:pPr>
+      <w:r>
+        <w:rPr>
+          <w:lang w:val="en-US"/>
+        </w:rPr>
+        <w:drawing>
+          <wp:inline distT="0" distB="0" distL="0" distR="0" wp14:anchorId="21DC805C" wp14:editId="0DAEE8DA">
+            <wp:extent cx="4429743" cy="2010056"/>
+            <wp:effectExtent l="0" t="0" r="0" b="9525"/>
+            <wp:docPr id="14" name="Picture 14"/>
+            <wp:cNvGraphicFramePr>
+              <a:graphicFrameLocks xmlns:a="http://schemas.openxmlformats.org/drawingml/2006/main" noChangeAspect="1"/>
+            </wp:cNvGraphicFramePr>
+            <a:graphic xmlns:a="http://schemas.openxmlformats.org/drawingml/2006/main">
+              <a:graphicData uri="http://schemas.openxmlformats.org/drawingml/2006/picture">
+                <pic:pic xmlns:pic="http://schemas.openxmlformats.org/drawingml/2006/picture">
+                  <pic:nvPicPr>
+                    <pic:cNvPr id="1" name=""/>
+                    <pic:cNvPicPr/>
+                  </pic:nvPicPr>
+                  <pic:blipFill>
+                    <a:blip r:embed="rId14"/>
+                    <a:stretch>
+                      <a:fillRect/>
+                    </a:stretch>
+                  </pic:blipFill>
+                  <pic:spPr>
+                    <a:xfrm>
+                      <a:off x="0" y="0"/>
+                      <a:ext cx="4429743" cy="2010056"/>
+                    </a:xfrm>
+                    <a:prstGeom prst="rect">
+                      <a:avLst/>
+                    </a:prstGeom>
+                  </pic:spPr>
+                </pic:pic>
+              </a:graphicData>
+            </a:graphic>
+          </wp:inline>
+        </w:drawing>
+      </w:r>
+    </w:p>
+    <w:p>
+      <w:pPr>
+        <w:rPr>
+          <w:lang w:val="en-US"/>
+        </w:rPr>
+      </w:pPr>
+      <w:r>
+        <w:rPr>
+          <w:lang w:val="en-US"/>
+        </w:rPr>
+        <w:t>In the main menu there are six options for the player to choose:</w:t>
+      </w:r>
+    </w:p>
+    <w:p>
+      <w:pPr>
+        <w:pStyle w:val="ListParagraph"/>
+        <w:numPr>
+          <w:ilvl w:val="0"/>
+          <w:numId w:val="3"/>
+        </w:numPr>
+        <w:rPr>
+          <w:lang w:val="en-US"/>
+        </w:rPr>
+      </w:pPr>
+      <w:r>
+        <w:rPr>
+          <w:b/>
+          <w:bCs/>
+          <w:u w:val="single"/>
+          <w:lang w:val="en-US"/>
+        </w:rPr>
+        <w:t>Start Game</w:t>
+      </w:r>
+      <w:r>
+        <w:rPr>
+          <w:lang w:val="en-US"/>
+        </w:rPr>
+        <w:br/>
+        <w:t>Starts a new game.</w:t>
+      </w:r>
+    </w:p>
+    <w:p>
+      <w:pPr>
+        <w:pStyle w:val="ListParagraph"/>
+        <w:numPr>
+          <w:ilvl w:val="0"/>
+          <w:numId w:val="3"/>
+        </w:numPr>
+        <w:rPr>
+          <w:lang w:val="en-US"/>
+        </w:rPr>
+      </w:pPr>
+      <w:r>
+        <w:rPr>
+          <w:lang w:val="en-US"/>
+        </w:rPr>
+        <w:drawing>
+          <wp:anchor distT="0" distB="0" distL="114300" distR="114300" simplePos="0" relativeHeight="251658240" behindDoc="0" locked="0" layoutInCell="1" allowOverlap="1" wp14:anchorId="1EF23A1C" wp14:editId="45216C92">
+            <wp:simplePos x="0" y="0"/>
+            <wp:positionH relativeFrom="margin">
+              <wp:align>center</wp:align>
+            </wp:positionH>
+            <wp:positionV relativeFrom="paragraph">
+              <wp:posOffset>724535</wp:posOffset>
+            </wp:positionV>
+            <wp:extent cx="3429000" cy="1809750"/>
+            <wp:effectExtent l="0" t="0" r="0" b="0"/>
+            <wp:wrapTopAndBottom/>
+            <wp:docPr id="15" name="Picture 15"/>
+            <wp:cNvGraphicFramePr>
+              <a:graphicFrameLocks xmlns:a="http://schemas.openxmlformats.org/drawingml/2006/main" noChangeAspect="1"/>
+            </wp:cNvGraphicFramePr>
+            <a:graphic xmlns:a="http://schemas.openxmlformats.org/drawingml/2006/main">
+              <a:graphicData uri="http://schemas.openxmlformats.org/drawingml/2006/picture">
+                <pic:pic xmlns:pic="http://schemas.openxmlformats.org/drawingml/2006/picture">
+                  <pic:nvPicPr>
+                    <pic:cNvPr id="1" name=""/>
+                    <pic:cNvPicPr/>
+                  </pic:nvPicPr>
+                  <pic:blipFill>
+                    <a:blip r:embed="rId15">
+                      <a:extLst>
+                        <a:ext uri="{28A0092B-C50C-407E-A947-70E740481C1C}">
+                          <a14:useLocalDpi xmlns:a14="http://schemas.microsoft.com/office/drawing/2010/main" val="0"/>
+                        </a:ext>
+                      </a:extLst>
+                    </a:blip>
+                    <a:stretch>
+                      <a:fillRect/>
+                    </a:stretch>
+                  </pic:blipFill>
+                  <pic:spPr>
+                    <a:xfrm>
+                      <a:off x="0" y="0"/>
+                      <a:ext cx="3429000" cy="1809750"/>
+                    </a:xfrm>
+                    <a:prstGeom prst="rect">
+                      <a:avLst/>
+                    </a:prstGeom>
+                  </pic:spPr>
+                </pic:pic>
+              </a:graphicData>
+            </a:graphic>
+          </wp:anchor>
+        </w:drawing>
+      </w:r>
+      <w:r>
+        <w:rPr>
+          <w:b/>
+          <w:bCs/>
+          <w:u w:val="single"/>
+          <w:lang w:val="en-US"/>
+        </w:rPr>
+        <w:t>Settings</w:t>
+      </w:r>
+      <w:r>
+        <w:rPr>
+          <w:lang w:val="en-US"/>
+        </w:rPr>
+        <w:br/>
+      </w:r>
+      <w:r>
+        <w:rPr>
+          <w:lang w:val="en-US"/>
+        </w:rPr>
+        <w:t>A settings menu where the player</w:t>
+      </w:r>
+      <w:r>
+        <w:rPr>
+          <w:lang w:val="en-US"/>
+        </w:rPr>
+        <w:t xml:space="preserve"> can adjust the difficulty of the game (beginner, normal, or expert), as well as adjust the volume of the background music and sound effects.</w:t>
+      </w:r>
+      <w:r>
+        <w:rPr>
+          <w:lang w:val="en-US"/>
+        </w:rPr>
+        <w:br/>
+      </w:r>
+      <w:r>
+        <w:rPr>
+          <w:lang w:val="en-US"/>
+        </w:rPr>
+        <w:br/>
+      </w:r>
+    </w:p>
+    <w:p>
+      <w:pPr>
+        <w:pStyle w:val="ListParagraph"/>
+        <w:numPr>
+          <w:ilvl w:val="0"/>
+          <w:numId w:val="3"/>
+        </w:numPr>
+        <w:rPr>
+          <w:lang w:val="en-US"/>
+        </w:rPr>
+      </w:pPr>
+      <w:r>
+        <w:rPr>
+          <w:lang w:val="en-US"/>
+        </w:rPr>
+        <w:lastRenderedPageBreak/>
+        <w:drawing>
+          <wp:anchor distT="0" distB="0" distL="114300" distR="114300" simplePos="0" relativeHeight="251659264" behindDoc="0" locked="0" layoutInCell="1" allowOverlap="1" wp14:anchorId="041BE0EC" wp14:editId="07394387">
+            <wp:simplePos x="0" y="0"/>
+            <wp:positionH relativeFrom="margin">
+              <wp:align>center</wp:align>
+            </wp:positionH>
+            <wp:positionV relativeFrom="paragraph">
+              <wp:posOffset>495300</wp:posOffset>
+            </wp:positionV>
+            <wp:extent cx="3343275" cy="2076450"/>
+            <wp:effectExtent l="0" t="0" r="9525" b="0"/>
+            <wp:wrapTopAndBottom/>
+            <wp:docPr id="16" name="Picture 16"/>
+            <wp:cNvGraphicFramePr>
+              <a:graphicFrameLocks xmlns:a="http://schemas.openxmlformats.org/drawingml/2006/main" noChangeAspect="1"/>
+            </wp:cNvGraphicFramePr>
+            <a:graphic xmlns:a="http://schemas.openxmlformats.org/drawingml/2006/main">
+              <a:graphicData uri="http://schemas.openxmlformats.org/drawingml/2006/picture">
+                <pic:pic xmlns:pic="http://schemas.openxmlformats.org/drawingml/2006/picture">
+                  <pic:nvPicPr>
+                    <pic:cNvPr id="1" name=""/>
+                    <pic:cNvPicPr/>
+                  </pic:nvPicPr>
+                  <pic:blipFill>
+                    <a:blip r:embed="rId16">
+                      <a:extLst>
+                        <a:ext uri="{28A0092B-C50C-407E-A947-70E740481C1C}">
+                          <a14:useLocalDpi xmlns:a14="http://schemas.microsoft.com/office/drawing/2010/main" val="0"/>
+                        </a:ext>
+                      </a:extLst>
+                    </a:blip>
+                    <a:stretch>
+                      <a:fillRect/>
+                    </a:stretch>
+                  </pic:blipFill>
+                  <pic:spPr>
+                    <a:xfrm>
+                      <a:off x="0" y="0"/>
+                      <a:ext cx="3343275" cy="2076450"/>
+                    </a:xfrm>
+                    <a:prstGeom prst="rect">
+                      <a:avLst/>
+                    </a:prstGeom>
+                  </pic:spPr>
+                </pic:pic>
+              </a:graphicData>
+            </a:graphic>
+          </wp:anchor>
+        </w:drawing>
+      </w:r>
+      <w:r>
+        <w:rPr>
+          <w:b/>
+          <w:bCs/>
+          <w:u w:val="single"/>
+          <w:lang w:val="en-US"/>
+        </w:rPr>
+        <w:t>High scores</w:t>
+      </w:r>
+      <w:r>
+        <w:rPr>
+          <w:b/>
+          <w:bCs/>
+          <w:u w:val="single"/>
+          <w:lang w:val="en-US"/>
+        </w:rPr>
+        <w:br/>
+      </w:r>
+      <w:r>
+        <w:rPr>
+          <w:lang w:val="en-US"/>
+        </w:rPr>
+        <w:t>Shows</w:t>
+      </w:r>
+      <w:r>
+        <w:rPr>
+          <w:lang w:val="en-US"/>
+        </w:rPr>
+        <w:t xml:space="preserve"> the score leaderboards for the game for each of the three difficulties.</w:t>
+      </w:r>
+      <w:r>
+        <w:rPr>
+          <w:lang w:val="en-US"/>
+        </w:rPr>
+        <w:br/>
+      </w:r>
+    </w:p>
+    <w:p>
+      <w:pPr>
+        <w:pStyle w:val="ListParagraph"/>
+        <w:numPr>
+          <w:ilvl w:val="0"/>
+          <w:numId w:val="3"/>
+        </w:numPr>
+        <w:rPr>
+          <w:lang w:val="en-US"/>
+        </w:rPr>
+      </w:pPr>
+      <w:r>
+        <w:rPr>
+          <w:lang w:val="en-US"/>
+        </w:rPr>
+        <w:drawing>
+          <wp:anchor distT="0" distB="0" distL="114300" distR="114300" simplePos="0" relativeHeight="251660288" behindDoc="0" locked="0" layoutInCell="1" allowOverlap="1" wp14:anchorId="0AC67BB3" wp14:editId="44851B13">
+            <wp:simplePos x="0" y="0"/>
+            <wp:positionH relativeFrom="margin">
+              <wp:align>center</wp:align>
+            </wp:positionH>
+            <wp:positionV relativeFrom="paragraph">
+              <wp:posOffset>478790</wp:posOffset>
+            </wp:positionV>
+            <wp:extent cx="2847975" cy="2400300"/>
+            <wp:effectExtent l="0" t="0" r="9525" b="0"/>
+            <wp:wrapTopAndBottom/>
+            <wp:docPr id="17" name="Picture 17"/>
+            <wp:cNvGraphicFramePr>
+              <a:graphicFrameLocks xmlns:a="http://schemas.openxmlformats.org/drawingml/2006/main" noChangeAspect="1"/>
+            </wp:cNvGraphicFramePr>
+            <a:graphic xmlns:a="http://schemas.openxmlformats.org/drawingml/2006/main">
+              <a:graphicData uri="http://schemas.openxmlformats.org/drawingml/2006/picture">
+                <pic:pic xmlns:pic="http://schemas.openxmlformats.org/drawingml/2006/picture">
+                  <pic:nvPicPr>
+                    <pic:cNvPr id="1" name=""/>
+                    <pic:cNvPicPr/>
+                  </pic:nvPicPr>
+                  <pic:blipFill>
+                    <a:blip r:embed="rId17">
+                      <a:extLst>
+                        <a:ext uri="{28A0092B-C50C-407E-A947-70E740481C1C}">
+                          <a14:useLocalDpi xmlns:a14="http://schemas.microsoft.com/office/drawing/2010/main" val="0"/>
+                        </a:ext>
+                      </a:extLst>
+                    </a:blip>
+                    <a:stretch>
+                      <a:fillRect/>
+                    </a:stretch>
+                  </pic:blipFill>
+                  <pic:spPr>
+                    <a:xfrm>
+                      <a:off x="0" y="0"/>
+                      <a:ext cx="2847975" cy="2400300"/>
+                    </a:xfrm>
+                    <a:prstGeom prst="rect">
+                      <a:avLst/>
+                    </a:prstGeom>
+                  </pic:spPr>
+                </pic:pic>
+              </a:graphicData>
+            </a:graphic>
+          </wp:anchor>
+        </w:drawing>
+      </w:r>
+      <w:r>
+        <w:rPr>
+          <w:b/>
+          <w:bCs/>
+          <w:u w:val="single"/>
+          <w:lang w:val="en-US"/>
+        </w:rPr>
+        <w:t>How To Play</w:t>
+      </w:r>
+      <w:r>
+        <w:rPr>
+          <w:b/>
+          <w:bCs/>
+          <w:u w:val="single"/>
+          <w:lang w:val="en-US"/>
+        </w:rPr>
+        <w:br/>
+      </w:r>
+      <w:r>
+        <w:rPr>
+          <w:lang w:val="en-US"/>
+        </w:rPr>
+        <w:t>Shows a</w:t>
+      </w:r>
+      <w:r>
+        <w:rPr>
+          <w:lang w:val="en-US"/>
+        </w:rPr>
+        <w:t xml:space="preserve"> brief overview of how to play the game.</w:t>
+      </w:r>
+      <w:r>
+        <w:rPr>
+          <w:lang w:val="en-US"/>
+        </w:rPr>
+        <w:br/>
+      </w:r>
+    </w:p>
+    <w:p>
+      <w:pPr>
+        <w:pStyle w:val="ListParagraph"/>
+        <w:numPr>
+          <w:ilvl w:val="0"/>
+          <w:numId w:val="3"/>
+        </w:numPr>
+        <w:rPr>
+          <w:lang w:val="en-US"/>
+        </w:rPr>
+      </w:pPr>
+      <w:r>
+        <w:rPr>
+          <w:b/>
+          <w:bCs/>
+          <w:u w:val="single"/>
+          <w:lang w:val="en-US"/>
+        </w:rPr>
+        <w:drawing>
+          <wp:anchor distT="0" distB="0" distL="114300" distR="114300" simplePos="0" relativeHeight="251661312" behindDoc="0" locked="0" layoutInCell="1" allowOverlap="1" wp14:anchorId="18E2D30E" wp14:editId="58DED3BD">
+            <wp:simplePos x="0" y="0"/>
+            <wp:positionH relativeFrom="margin">
+              <wp:align>center</wp:align>
+            </wp:positionH>
+            <wp:positionV relativeFrom="paragraph">
+              <wp:posOffset>364490</wp:posOffset>
+            </wp:positionV>
+            <wp:extent cx="2657475" cy="1828800"/>
+            <wp:effectExtent l="0" t="0" r="9525" b="0"/>
+            <wp:wrapTopAndBottom/>
+            <wp:docPr id="18" name="Picture 18"/>
+            <wp:cNvGraphicFramePr>
+              <a:graphicFrameLocks xmlns:a="http://schemas.openxmlformats.org/drawingml/2006/main" noChangeAspect="1"/>
+            </wp:cNvGraphicFramePr>
+            <a:graphic xmlns:a="http://schemas.openxmlformats.org/drawingml/2006/main">
+              <a:graphicData uri="http://schemas.openxmlformats.org/drawingml/2006/picture">
+                <pic:pic xmlns:pic="http://schemas.openxmlformats.org/drawingml/2006/picture">
+                  <pic:nvPicPr>
+                    <pic:cNvPr id="1" name=""/>
+                    <pic:cNvPicPr/>
+                  </pic:nvPicPr>
+                  <pic:blipFill>
+                    <a:blip r:embed="rId18">
+                      <a:extLst>
+                        <a:ext uri="{28A0092B-C50C-407E-A947-70E740481C1C}">
+                          <a14:useLocalDpi xmlns:a14="http://schemas.microsoft.com/office/drawing/2010/main" val="0"/>
+                        </a:ext>
+                      </a:extLst>
+                    </a:blip>
+                    <a:stretch>
+                      <a:fillRect/>
+                    </a:stretch>
+                  </pic:blipFill>
+                  <pic:spPr>
+                    <a:xfrm>
+                      <a:off x="0" y="0"/>
+                      <a:ext cx="2657475" cy="1828800"/>
+                    </a:xfrm>
+                    <a:prstGeom prst="rect">
+                      <a:avLst/>
+                    </a:prstGeom>
+                  </pic:spPr>
+                </pic:pic>
+              </a:graphicData>
+            </a:graphic>
+          </wp:anchor>
+        </w:drawing>
+      </w:r>
+      <w:r>
+        <w:rPr>
+          <w:b/>
+          <w:bCs/>
+          <w:u w:val="single"/>
+          <w:lang w:val="en-US"/>
+        </w:rPr>
+        <w:t>Controls</w:t>
+      </w:r>
+      <w:r>
+        <w:rPr>
+          <w:b/>
+          <w:bCs/>
+          <w:u w:val="single"/>
+          <w:lang w:val="en-US"/>
+        </w:rPr>
+        <w:br/>
+      </w:r>
+      <w:r>
+        <w:rPr>
+          <w:lang w:val="en-US"/>
+        </w:rPr>
+        <w:t>Displays a diagram that of the controls for the game.</w:t>
+      </w:r>
+      <w:r>
+        <w:rPr>
+          <w:b/>
+          <w:bCs/>
+          <w:u w:val="single"/>
+          <w:lang w:val="en-US"/>
+        </w:rPr>
+        <w:br/>
+      </w:r>
+    </w:p>
+    <w:p>
+      <w:pPr>
+        <w:pStyle w:val="ListParagraph"/>
+        <w:numPr>
+          <w:ilvl w:val="0"/>
+          <w:numId w:val="3"/>
+        </w:numPr>
+        <w:rPr>
+          <w:lang w:val="en-US"/>
+        </w:rPr>
+      </w:pPr>
+      <w:r>
+        <w:rPr>
+          <w:b/>
+          <w:bCs/>
+          <w:u w:val="single"/>
+          <w:lang w:val="en-US"/>
+        </w:rPr>
+        <w:t>Quit</w:t>
+      </w:r>
+      <w:r>
+        <w:rPr>
+          <w:b/>
+          <w:bCs/>
+          <w:u w:val="single"/>
+          <w:lang w:val="en-US"/>
+        </w:rPr>
+        <w:br/>
+      </w:r>
+      <w:r>
+        <w:rPr>
+          <w:lang w:val="en-US"/>
+        </w:rPr>
+        <w:t>Exits</w:t>
+      </w:r>
+      <w:r>
+        <w:rPr>
+          <w:lang w:val="en-US"/>
+        </w:rPr>
+        <w:t xml:space="preserve"> the game.</w:t>
+      </w:r>
+    </w:p>
+    <w:p>
+      <w:pPr>
+        <w:pStyle w:val="Heading3"/>
+        <w:rPr>
+          <w:lang w:val="en-US"/>
+        </w:rPr>
+      </w:pPr>
+      <w:r>
+        <w:rPr>
+          <w:lang w:val="en-US"/>
+        </w:rPr>
+        <w:lastRenderedPageBreak/>
+        <w:t>In Game</w:t>
+      </w:r>
+    </w:p>
+    <w:p>
+      <w:pPr>
+        <w:rPr>
+          <w:lang w:val="en-US"/>
+        </w:rPr>
+      </w:pPr>
+      <w:r>
+        <w:rPr>
+          <w:noProof/>
+        </w:rPr>
+        <w:drawing>
+          <wp:anchor distT="0" distB="0" distL="114300" distR="114300" simplePos="0" relativeHeight="251664384" behindDoc="0" locked="0" layoutInCell="1" allowOverlap="1" wp14:anchorId="297F378A" wp14:editId="3357B0A1">
+            <wp:simplePos x="0" y="0"/>
+            <wp:positionH relativeFrom="margin">
+              <wp:align>center</wp:align>
+            </wp:positionH>
+            <wp:positionV relativeFrom="paragraph">
+              <wp:posOffset>605790</wp:posOffset>
+            </wp:positionV>
+            <wp:extent cx="1724025" cy="1724025"/>
+            <wp:effectExtent l="0" t="0" r="9525" b="9525"/>
+            <wp:wrapTopAndBottom/>
+            <wp:docPr id="21" name="Picture 21"/>
+            <wp:cNvGraphicFramePr>
+              <a:graphicFrameLocks xmlns:a="http://schemas.openxmlformats.org/drawingml/2006/main" noChangeAspect="1"/>
+            </wp:cNvGraphicFramePr>
+            <a:graphic xmlns:a="http://schemas.openxmlformats.org/drawingml/2006/main">
+              <a:graphicData uri="http://schemas.openxmlformats.org/drawingml/2006/picture">
+                <pic:pic xmlns:pic="http://schemas.openxmlformats.org/drawingml/2006/picture">
+                  <pic:nvPicPr>
+                    <pic:cNvPr id="0" name="Picture 9"/>
+                    <pic:cNvPicPr>
+                      <a:picLocks noChangeAspect="1" noChangeArrowheads="1"/>
+                    </pic:cNvPicPr>
+                  </pic:nvPicPr>
+                  <pic:blipFill>
+                    <a:blip r:embed="rId19" cstate="print">
+                      <a:extLst>
+                        <a:ext uri="{28A0092B-C50C-407E-A947-70E740481C1C}">
+                          <a14:useLocalDpi xmlns:a14="http://schemas.microsoft.com/office/drawing/2010/main" val="0"/>
+                        </a:ext>
+                      </a:extLst>
+                    </a:blip>
+                    <a:srcRect/>
+                    <a:stretch>
+                      <a:fillRect/>
+                    </a:stretch>
+                  </pic:blipFill>
+                  <pic:spPr bwMode="auto">
+                    <a:xfrm>
+                      <a:off x="0" y="0"/>
+                      <a:ext cx="1724025" cy="1724025"/>
+                    </a:xfrm>
+                    <a:prstGeom prst="rect">
+                      <a:avLst/>
+                    </a:prstGeom>
+                    <a:noFill/>
+                    <a:ln>
+                      <a:noFill/>
+                    </a:ln>
+                  </pic:spPr>
+                </pic:pic>
+              </a:graphicData>
+            </a:graphic>
+            <wp14:sizeRelH relativeFrom="page">
+              <wp14:pctWidth>0</wp14:pctWidth>
+            </wp14:sizeRelH>
+            <wp14:sizeRelV relativeFrom="page">
+              <wp14:pctHeight>0</wp14:pctHeight>
+            </wp14:sizeRelV>
+          </wp:anchor>
+        </w:drawing>
+      </w:r>
+      <w:r>
+        <w:rPr>
+          <w:lang w:val="en-US"/>
+        </w:rPr>
+        <w:t>The player is loaded into an arena with two walls of bricks in front of them. By default, the orb loader is to the right of the player, from which they can grab a new orb at any time (assuming there are orbs left)</w:t>
+      </w:r>
+      <w:r>
+        <w:rPr>
+          <w:lang w:val="en-US"/>
+        </w:rPr>
+        <w:t>:</w:t>
+      </w:r>
+    </w:p>
+    <w:p>
+      <w:pPr>
+        <w:rPr>
+          <w:lang w:val="en-US"/>
+        </w:rPr>
+      </w:pPr>
+    </w:p>
+    <w:p>
+      <w:pPr>
+        <w:rPr>
+          <w:lang w:val="en-US"/>
+        </w:rPr>
+      </w:pPr>
+      <w:r>
+        <w:rPr>
+          <w:lang w:val="en-US"/>
+        </w:rPr>
+        <w:t xml:space="preserve">In addition, by default a racket is </w:t>
+      </w:r>
+      <w:r>
+        <w:rPr>
+          <w:lang w:val="en-US"/>
+        </w:rPr>
+        <w:t>available</w:t>
+      </w:r>
+      <w:r>
+        <w:rPr>
+          <w:lang w:val="en-US"/>
+        </w:rPr>
+        <w:t xml:space="preserve"> on the left side of the player for them to grab and use to hit orbs</w:t>
+      </w:r>
+      <w:r>
+        <w:rPr>
+          <w:lang w:val="en-US"/>
+        </w:rPr>
+        <w:t>:</w:t>
+      </w:r>
+    </w:p>
+    <w:p>
+      <w:pPr>
+        <w:rPr>
+          <w:lang w:val="en-US"/>
+        </w:rPr>
+      </w:pPr>
+      <w:r>
+        <w:rPr>
+          <w:noProof/>
+        </w:rPr>
+        <w:drawing>
+          <wp:anchor distT="0" distB="0" distL="114300" distR="114300" simplePos="0" relativeHeight="251663360" behindDoc="0" locked="0" layoutInCell="1" allowOverlap="1" wp14:anchorId="1C8BE9C0" wp14:editId="5AA5AD17">
+            <wp:simplePos x="0" y="0"/>
+            <wp:positionH relativeFrom="margin">
+              <wp:align>center</wp:align>
+            </wp:positionH>
+            <wp:positionV relativeFrom="paragraph">
+              <wp:posOffset>210820</wp:posOffset>
+            </wp:positionV>
+            <wp:extent cx="1885950" cy="1885950"/>
+            <wp:effectExtent l="0" t="0" r="0" b="0"/>
+            <wp:wrapTopAndBottom/>
+            <wp:docPr id="20" name="Picture 20"/>
+            <wp:cNvGraphicFramePr>
+              <a:graphicFrameLocks xmlns:a="http://schemas.openxmlformats.org/drawingml/2006/main" noChangeAspect="1"/>
+            </wp:cNvGraphicFramePr>
+            <a:graphic xmlns:a="http://schemas.openxmlformats.org/drawingml/2006/main">
+              <a:graphicData uri="http://schemas.openxmlformats.org/drawingml/2006/picture">
+                <pic:pic xmlns:pic="http://schemas.openxmlformats.org/drawingml/2006/picture">
+                  <pic:nvPicPr>
+                    <pic:cNvPr id="0" name="Picture 7"/>
+                    <pic:cNvPicPr>
+                      <a:picLocks noChangeAspect="1" noChangeArrowheads="1"/>
+                    </pic:cNvPicPr>
+                  </pic:nvPicPr>
+                  <pic:blipFill>
+                    <a:blip r:embed="rId20" cstate="print">
+                      <a:extLst>
+                        <a:ext uri="{28A0092B-C50C-407E-A947-70E740481C1C}">
+                          <a14:useLocalDpi xmlns:a14="http://schemas.microsoft.com/office/drawing/2010/main" val="0"/>
+                        </a:ext>
+                      </a:extLst>
+                    </a:blip>
+                    <a:srcRect/>
+                    <a:stretch>
+                      <a:fillRect/>
+                    </a:stretch>
+                  </pic:blipFill>
+                  <pic:spPr bwMode="auto">
+                    <a:xfrm>
+                      <a:off x="0" y="0"/>
+                      <a:ext cx="1885950" cy="1885950"/>
+                    </a:xfrm>
+                    <a:prstGeom prst="rect">
+                      <a:avLst/>
+                    </a:prstGeom>
+                    <a:noFill/>
+                    <a:ln>
+                      <a:noFill/>
+                    </a:ln>
+                  </pic:spPr>
+                </pic:pic>
+              </a:graphicData>
+            </a:graphic>
+            <wp14:sizeRelH relativeFrom="margin">
+              <wp14:pctWidth>0</wp14:pctWidth>
+            </wp14:sizeRelH>
+            <wp14:sizeRelV relativeFrom="margin">
+              <wp14:pctHeight>0</wp14:pctHeight>
+            </wp14:sizeRelV>
+          </wp:anchor>
+        </w:drawing>
+      </w:r>
+    </w:p>
+    <w:p>
+      <w:pPr>
+        <w:rPr>
+          <w:lang w:val="en-US"/>
+        </w:rPr>
+      </w:pPr>
+    </w:p>
+    <w:p>
+      <w:pPr>
+        <w:rPr>
+          <w:lang w:val="en-US"/>
+        </w:rPr>
+      </w:pPr>
+      <w:r>
+        <w:rPr>
+          <w:noProof/>
+        </w:rPr>
+        <w:drawing>
+          <wp:anchor distT="0" distB="0" distL="114300" distR="114300" simplePos="0" relativeHeight="251665408" behindDoc="0" locked="0" layoutInCell="1" allowOverlap="1" wp14:anchorId="00CAE54E" wp14:editId="36B287E6">
+            <wp:simplePos x="0" y="0"/>
+            <wp:positionH relativeFrom="margin">
+              <wp:align>center</wp:align>
+            </wp:positionH>
+            <wp:positionV relativeFrom="paragraph">
+              <wp:posOffset>568960</wp:posOffset>
+            </wp:positionV>
+            <wp:extent cx="2105025" cy="2105025"/>
+            <wp:effectExtent l="0" t="0" r="9525" b="9525"/>
+            <wp:wrapTopAndBottom/>
+            <wp:docPr id="22" name="Picture 22"/>
+            <wp:cNvGraphicFramePr>
+              <a:graphicFrameLocks xmlns:a="http://schemas.openxmlformats.org/drawingml/2006/main" noChangeAspect="1"/>
+            </wp:cNvGraphicFramePr>
+            <a:graphic xmlns:a="http://schemas.openxmlformats.org/drawingml/2006/main">
+              <a:graphicData uri="http://schemas.openxmlformats.org/drawingml/2006/picture">
+                <pic:pic xmlns:pic="http://schemas.openxmlformats.org/drawingml/2006/picture">
+                  <pic:nvPicPr>
+                    <pic:cNvPr id="0" name="Picture 11"/>
+                    <pic:cNvPicPr>
+                      <a:picLocks noChangeAspect="1" noChangeArrowheads="1"/>
+                    </pic:cNvPicPr>
+                  </pic:nvPicPr>
+                  <pic:blipFill>
+                    <a:blip r:embed="rId21" cstate="print">
+                      <a:extLst>
+                        <a:ext uri="{28A0092B-C50C-407E-A947-70E740481C1C}">
+                          <a14:useLocalDpi xmlns:a14="http://schemas.microsoft.com/office/drawing/2010/main" val="0"/>
+                        </a:ext>
+                      </a:extLst>
+                    </a:blip>
+                    <a:srcRect/>
+                    <a:stretch>
+                      <a:fillRect/>
+                    </a:stretch>
+                  </pic:blipFill>
+                  <pic:spPr bwMode="auto">
+                    <a:xfrm>
+                      <a:off x="0" y="0"/>
+                      <a:ext cx="2105025" cy="2105025"/>
+                    </a:xfrm>
+                    <a:prstGeom prst="rect">
+                      <a:avLst/>
+                    </a:prstGeom>
+                    <a:noFill/>
+                    <a:ln>
+                      <a:noFill/>
+                    </a:ln>
+                  </pic:spPr>
+                </pic:pic>
+              </a:graphicData>
+            </a:graphic>
+          </wp:anchor>
+        </w:drawing>
+      </w:r>
+      <w:r>
+        <w:rPr>
+          <w:lang w:val="en-US"/>
+        </w:rPr>
+        <w:t>The number of new orbs left for the player to grab from the loader, as well as the current score and the time left in the game, are all visible in front of the player:</w:t>
+      </w:r>
+    </w:p>
+    <w:p>
+      <w:pPr>
+        <w:rPr>
+          <w:lang w:val="en-US"/>
+        </w:rPr>
+      </w:pPr>
+      <w:r>
+        <w:rPr>
+          <w:lang w:val="en-US"/>
+        </w:rPr>
+        <w:br/>
+      </w:r>
+    </w:p>
+    <w:p>
+      <w:pPr>
+        <w:rPr>
+          <w:lang w:val="en-US"/>
+        </w:rPr>
+      </w:pPr>
+      <w:r>
+        <w:rPr>
+          <w:lang w:val="en-US"/>
+        </w:rPr>
+        <w:lastRenderedPageBreak/>
+        <w:t>When the player catches a powerup, the time left for the affect of the powerup is displayed in front of and above the player:</w:t>
+      </w:r>
+    </w:p>
+    <w:p>
+      <w:pPr>
+        <w:rPr>
+          <w:lang w:val="en-US"/>
+        </w:rPr>
+      </w:pPr>
+      <w:r>
+        <w:rPr>
+          <w:noProof/>
+        </w:rPr>
+        <w:drawing>
+          <wp:anchor distT="0" distB="0" distL="114300" distR="114300" simplePos="0" relativeHeight="251666432" behindDoc="0" locked="0" layoutInCell="1" allowOverlap="1" wp14:anchorId="781349A4" wp14:editId="6781EB20">
+            <wp:simplePos x="0" y="0"/>
+            <wp:positionH relativeFrom="margin">
+              <wp:align>center</wp:align>
+            </wp:positionH>
+            <wp:positionV relativeFrom="paragraph">
+              <wp:posOffset>200025</wp:posOffset>
+            </wp:positionV>
+            <wp:extent cx="2028825" cy="2028825"/>
+            <wp:effectExtent l="0" t="0" r="9525" b="9525"/>
+            <wp:wrapTopAndBottom/>
+            <wp:docPr id="23" name="Picture 23"/>
+            <wp:cNvGraphicFramePr>
+              <a:graphicFrameLocks xmlns:a="http://schemas.openxmlformats.org/drawingml/2006/main" noChangeAspect="1"/>
+            </wp:cNvGraphicFramePr>
+            <a:graphic xmlns:a="http://schemas.openxmlformats.org/drawingml/2006/main">
+              <a:graphicData uri="http://schemas.openxmlformats.org/drawingml/2006/picture">
+                <pic:pic xmlns:pic="http://schemas.openxmlformats.org/drawingml/2006/picture">
+                  <pic:nvPicPr>
+                    <pic:cNvPr id="0" name="Picture 13"/>
+                    <pic:cNvPicPr>
+                      <a:picLocks noChangeAspect="1" noChangeArrowheads="1"/>
+                    </pic:cNvPicPr>
+                  </pic:nvPicPr>
+                  <pic:blipFill>
+                    <a:blip r:embed="rId22" cstate="print">
+                      <a:extLst>
+                        <a:ext uri="{28A0092B-C50C-407E-A947-70E740481C1C}">
+                          <a14:useLocalDpi xmlns:a14="http://schemas.microsoft.com/office/drawing/2010/main" val="0"/>
+                        </a:ext>
+                      </a:extLst>
+                    </a:blip>
+                    <a:srcRect/>
+                    <a:stretch>
+                      <a:fillRect/>
+                    </a:stretch>
+                  </pic:blipFill>
+                  <pic:spPr bwMode="auto">
+                    <a:xfrm>
+                      <a:off x="0" y="0"/>
+                      <a:ext cx="2028825" cy="2028825"/>
+                    </a:xfrm>
+                    <a:prstGeom prst="rect">
+                      <a:avLst/>
+                    </a:prstGeom>
+                    <a:noFill/>
+                    <a:ln>
+                      <a:noFill/>
+                    </a:ln>
+                  </pic:spPr>
+                </pic:pic>
+              </a:graphicData>
+            </a:graphic>
+          </wp:anchor>
+        </w:drawing>
+      </w:r>
+    </w:p>
+    <w:p>
+      <w:pPr>
+        <w:rPr>
+          <w:lang w:val="en-US"/>
+        </w:rPr>
+      </w:pPr>
+    </w:p>
+    <w:p>
+      <w:pPr>
+        <w:rPr>
+          <w:lang w:val="en-US"/>
+        </w:rPr>
+      </w:pPr>
+      <w:r>
+        <w:rPr>
+          <w:noProof/>
+        </w:rPr>
+        <w:drawing>
+          <wp:anchor distT="0" distB="0" distL="114300" distR="114300" simplePos="0" relativeHeight="251668480" behindDoc="0" locked="0" layoutInCell="1" allowOverlap="1" wp14:anchorId="6B0CE0C6" wp14:editId="05F9813C">
+            <wp:simplePos x="0" y="0"/>
+            <wp:positionH relativeFrom="column">
+              <wp:posOffset>3124200</wp:posOffset>
+            </wp:positionH>
+            <wp:positionV relativeFrom="paragraph">
+              <wp:posOffset>468630</wp:posOffset>
+            </wp:positionV>
+            <wp:extent cx="1695450" cy="1695450"/>
+            <wp:effectExtent l="0" t="0" r="0" b="0"/>
+            <wp:wrapTopAndBottom/>
+            <wp:docPr id="25" name="Picture 25" descr="A picture containing diagram&#10;&#10;Description automatically generated"/>
+            <wp:cNvGraphicFramePr>
+              <a:graphicFrameLocks xmlns:a="http://schemas.openxmlformats.org/drawingml/2006/main" noChangeAspect="1"/>
+            </wp:cNvGraphicFramePr>
+            <a:graphic xmlns:a="http://schemas.openxmlformats.org/drawingml/2006/main">
+              <a:graphicData uri="http://schemas.openxmlformats.org/drawingml/2006/picture">
+                <pic:pic xmlns:pic="http://schemas.openxmlformats.org/drawingml/2006/picture">
+                  <pic:nvPicPr>
+                    <pic:cNvPr id="25" name="Picture 25" descr="A picture containing diagram&#10;&#10;Description automatically generated"/>
+                    <pic:cNvPicPr>
+                      <a:picLocks noChangeAspect="1" noChangeArrowheads="1"/>
+                    </pic:cNvPicPr>
+                  </pic:nvPicPr>
+                  <pic:blipFill>
+                    <a:blip r:embed="rId23" cstate="print">
+                      <a:extLst>
+                        <a:ext uri="{28A0092B-C50C-407E-A947-70E740481C1C}">
+                          <a14:useLocalDpi xmlns:a14="http://schemas.microsoft.com/office/drawing/2010/main" val="0"/>
+                        </a:ext>
+                      </a:extLst>
+                    </a:blip>
+                    <a:srcRect/>
+                    <a:stretch>
+                      <a:fillRect/>
+                    </a:stretch>
+                  </pic:blipFill>
+                  <pic:spPr bwMode="auto">
+                    <a:xfrm>
+                      <a:off x="0" y="0"/>
+                      <a:ext cx="1695450" cy="1695450"/>
+                    </a:xfrm>
+                    <a:prstGeom prst="rect">
+                      <a:avLst/>
+                    </a:prstGeom>
+                    <a:noFill/>
+                    <a:ln>
+                      <a:noFill/>
+                    </a:ln>
+                  </pic:spPr>
+                </pic:pic>
+              </a:graphicData>
+            </a:graphic>
+            <wp14:sizeRelH relativeFrom="page">
+              <wp14:pctWidth>0</wp14:pctWidth>
+            </wp14:sizeRelH>
+            <wp14:sizeRelV relativeFrom="page">
+              <wp14:pctHeight>0</wp14:pctHeight>
+            </wp14:sizeRelV>
+          </wp:anchor>
+        </w:drawing>
+      </w:r>
+      <w:r>
+        <w:rPr>
+          <w:noProof/>
+        </w:rPr>
+        <w:drawing>
+          <wp:anchor distT="0" distB="0" distL="114300" distR="114300" simplePos="0" relativeHeight="251667456" behindDoc="0" locked="0" layoutInCell="1" allowOverlap="1" wp14:anchorId="0ED5EF11" wp14:editId="54B1FCE6">
+            <wp:simplePos x="0" y="0"/>
+            <wp:positionH relativeFrom="column">
+              <wp:posOffset>752475</wp:posOffset>
+            </wp:positionH>
+            <wp:positionV relativeFrom="paragraph">
+              <wp:posOffset>430530</wp:posOffset>
+            </wp:positionV>
+            <wp:extent cx="1781175" cy="1781175"/>
+            <wp:effectExtent l="0" t="0" r="9525" b="9525"/>
+            <wp:wrapTopAndBottom/>
+            <wp:docPr id="24" name="Picture 24"/>
+            <wp:cNvGraphicFramePr>
+              <a:graphicFrameLocks xmlns:a="http://schemas.openxmlformats.org/drawingml/2006/main" noChangeAspect="1"/>
+            </wp:cNvGraphicFramePr>
+            <a:graphic xmlns:a="http://schemas.openxmlformats.org/drawingml/2006/main">
+              <a:graphicData uri="http://schemas.openxmlformats.org/drawingml/2006/picture">
+                <pic:pic xmlns:pic="http://schemas.openxmlformats.org/drawingml/2006/picture">
+                  <pic:nvPicPr>
+                    <pic:cNvPr id="0" name="Picture 15"/>
+                    <pic:cNvPicPr>
+                      <a:picLocks noChangeAspect="1" noChangeArrowheads="1"/>
+                    </pic:cNvPicPr>
+                  </pic:nvPicPr>
+                  <pic:blipFill>
+                    <a:blip r:embed="rId24" cstate="print">
+                      <a:extLst>
+                        <a:ext uri="{28A0092B-C50C-407E-A947-70E740481C1C}">
+                          <a14:useLocalDpi xmlns:a14="http://schemas.microsoft.com/office/drawing/2010/main" val="0"/>
+                        </a:ext>
+                      </a:extLst>
+                    </a:blip>
+                    <a:srcRect/>
+                    <a:stretch>
+                      <a:fillRect/>
+                    </a:stretch>
+                  </pic:blipFill>
+                  <pic:spPr bwMode="auto">
+                    <a:xfrm>
+                      <a:off x="0" y="0"/>
+                      <a:ext cx="1781175" cy="1781175"/>
+                    </a:xfrm>
+                    <a:prstGeom prst="rect">
+                      <a:avLst/>
+                    </a:prstGeom>
+                    <a:noFill/>
+                    <a:ln>
+                      <a:noFill/>
+                    </a:ln>
+                  </pic:spPr>
+                </pic:pic>
+              </a:graphicData>
+            </a:graphic>
+          </wp:anchor>
+        </w:drawing>
+      </w:r>
+      <w:r>
+        <w:rPr>
+          <w:lang w:val="en-US"/>
+        </w:rPr>
+        <w:t>Catching brick fragments displays their point worth:</w:t>
+      </w:r>
+    </w:p>
+    <w:p>
+      <w:pPr>
+        <w:rPr>
+          <w:lang w:val="en-US"/>
+        </w:rPr>
+      </w:pPr>
+    </w:p>
+    <w:p>
+      <w:pPr>
+        <w:pStyle w:val="Heading1"/>
+        <w:rPr>
+          <w:lang w:val="en-US"/>
+        </w:rPr>
+      </w:pPr>
+      <w:r>
+        <w:rPr>
+          <w:lang w:val="en-US"/>
+        </w:rPr>
         <w:t>Challenges</w:t>
       </w:r>
     </w:p>
@@ -889,38 +2144,46 @@
         <w:rPr>
           <w:lang w:val="en-US"/>
         </w:rPr>
-        <w:t xml:space="preserve"> edge or corner of a brick and not cause any fracture lines to be formed. To rectify this, we implemented a routine which checks how manty fracture line branch points were formed using the original angle of collision, and if the number is under a certain threshold (in are circumstance, 20) than we nudge the angle of collision in the direction of the center of the brick by five </w:t>
-      </w:r>
+        <w:t xml:space="preserve"> edge or corner of a brick and not cause any fracture lines to be formed. To rectify this, we implemented a routine which checks how manty fracture line branch points were formed using the original angle of collision, and if the number is under a certain threshold (in are circumstance, 20) than we nudge the angle of collision in the direction of the center of the brick by five degrees and rerun the algorithm. This process is continued until </w:t>
+      </w:r>
+      <w:proofErr w:type="gramStart"/>
+      <w:r>
+        <w:rPr>
+          <w:lang w:val="en-US"/>
+        </w:rPr>
+        <w:t>a number of</w:t>
+      </w:r>
+      <w:proofErr w:type="gramEnd"/>
+      <w:r>
+        <w:rPr>
+          <w:lang w:val="en-US"/>
+        </w:rPr>
+        <w:t xml:space="preserve"> fracture points</w:t>
+      </w:r>
+      <w:r>
+        <w:rPr>
+          <w:lang w:val="en-US"/>
+        </w:rPr>
+        <w:t xml:space="preserve"> above the threshold</w:t>
+      </w:r>
+      <w:r>
+        <w:rPr>
+          <w:lang w:val="en-US"/>
+        </w:rPr>
+        <w:t xml:space="preserve"> is obtained.</w:t>
+      </w:r>
+    </w:p>
+    <w:p>
+      <w:pPr>
+        <w:rPr>
+          <w:lang w:val="en-US"/>
+        </w:rPr>
+      </w:pPr>
       <w:r>
         <w:rPr>
           <w:lang w:val="en-US"/>
         </w:rPr>
         <w:lastRenderedPageBreak/>
-        <w:t>degrees and rerun the algorithm. This process is continued until a number of fracture points</w:t>
-      </w:r>
-      <w:r>
-        <w:rPr>
-          <w:lang w:val="en-US"/>
-        </w:rPr>
-        <w:t xml:space="preserve"> above the threshold</w:t>
-      </w:r>
-      <w:r>
-        <w:rPr>
-          <w:lang w:val="en-US"/>
-        </w:rPr>
-        <w:t xml:space="preserve"> is obtained.</w:t>
-      </w:r>
-    </w:p>
-    <w:p>
-      <w:pPr>
-        <w:rPr>
-          <w:lang w:val="en-US"/>
-        </w:rPr>
-      </w:pPr>
-      <w:r>
-        <w:rPr>
-          <w:lang w:val="en-US"/>
-        </w:rPr>
         <w:t xml:space="preserve">An additional balance needed to maintain was that between visuals and performance. Because the game was </w:t>
       </w:r>
       <w:r>
@@ -1018,7 +2281,21 @@
         <w:rPr>
           <w:lang w:val="en-US"/>
         </w:rPr>
-        <w:t xml:space="preserve"> at the moment of impact and thus saving processor resources. In addition, we utilized resource pooling for the fragment parent objects so that rather than be destroyed and initialized on every brick collision, these fragment objects could be simply enabled and disabled, </w:t>
+        <w:t xml:space="preserve"> </w:t>
+      </w:r>
+      <w:proofErr w:type="gramStart"/>
+      <w:r>
+        <w:rPr>
+          <w:lang w:val="en-US"/>
+        </w:rPr>
+        <w:t>at the moment</w:t>
+      </w:r>
+      <w:proofErr w:type="gramEnd"/>
+      <w:r>
+        <w:rPr>
+          <w:lang w:val="en-US"/>
+        </w:rPr>
+        <w:t xml:space="preserve"> of impact and thus saving processor resources. In addition, we utilized resource pooling for the fragment parent objects so that rather than be destroyed and initialized on every brick collision, these fragment objects could be simply enabled and disabled, </w:t>
       </w:r>
       <w:r>
         <w:rPr>
@@ -1043,7 +2320,21 @@
         <w:rPr>
           <w:lang w:val="en-US"/>
         </w:rPr>
-        <w:t xml:space="preserve"> On colliding with the bricks the ball creates a fracture line in the brick originating at the collision point and </w:t>
+        <w:t xml:space="preserve"> On colliding with the </w:t>
+      </w:r>
+      <w:proofErr w:type="gramStart"/>
+      <w:r>
+        <w:rPr>
+          <w:lang w:val="en-US"/>
+        </w:rPr>
+        <w:t>bricks</w:t>
+      </w:r>
+      <w:proofErr w:type="gramEnd"/>
+      <w:r>
+        <w:rPr>
+          <w:lang w:val="en-US"/>
+        </w:rPr>
+        <w:t xml:space="preserve"> the ball creates a fracture line in the brick originating at the collision point and </w:t>
       </w:r>
       <w:r>
         <w:rPr>
@@ -1240,7 +2531,21 @@
         <w:rPr>
           <w:lang w:val="en-US"/>
         </w:rPr>
-        <w:t xml:space="preserve">The Fragments Produced when the balls collide with the bricks are composed of voxels, which are pre-initialized when the scene is loaded. At the moment </w:t>
+        <w:t xml:space="preserve">The Fragments Produced when the balls collide with the bricks are composed of voxels, which are pre-initialized when the scene is loaded. </w:t>
+      </w:r>
+      <w:proofErr w:type="gramStart"/>
+      <w:r>
+        <w:rPr>
+          <w:lang w:val="en-US"/>
+        </w:rPr>
+        <w:t>At the moment</w:t>
+      </w:r>
+      <w:proofErr w:type="gramEnd"/>
+      <w:r>
+        <w:rPr>
+          <w:lang w:val="en-US"/>
+        </w:rPr>
+        <w:t xml:space="preserve"> </w:t>
       </w:r>
       <w:r>
         <w:rPr>
@@ -1349,28 +2654,28 @@
         <w:rPr>
           <w:lang w:val="en-US"/>
         </w:rPr>
+        <w:t>The algorithm then recursively repeats this process for each new voxel added for one more layer, while subtracting 10 from the distance score.</w:t>
+      </w:r>
+    </w:p>
+    <w:p>
+      <w:pPr>
+        <w:rPr>
+          <w:lang w:val="en-US"/>
+        </w:rPr>
+      </w:pPr>
+    </w:p>
+    <w:p>
+      <w:pPr>
+        <w:pStyle w:val="Heading1"/>
+        <w:rPr>
+          <w:lang w:val="en-US"/>
+        </w:rPr>
+      </w:pPr>
+      <w:r>
+        <w:rPr>
+          <w:lang w:val="en-US"/>
+        </w:rPr>
         <w:lastRenderedPageBreak/>
-        <w:t>The algorithm then recursively repeats this process for each new voxel added for one more layer, while subtracting 10 from the distance score.</w:t>
-      </w:r>
-    </w:p>
-    <w:p>
-      <w:pPr>
-        <w:rPr>
-          <w:lang w:val="en-US"/>
-        </w:rPr>
-      </w:pPr>
-    </w:p>
-    <w:p>
-      <w:pPr>
-        <w:pStyle w:val="Heading1"/>
-        <w:rPr>
-          <w:lang w:val="en-US"/>
-        </w:rPr>
-      </w:pPr>
-      <w:r>
-        <w:rPr>
-          <w:lang w:val="en-US"/>
-        </w:rPr>
         <w:t>Conclusion</w:t>
       </w:r>
     </w:p>
@@ -1400,7 +2705,7 @@
       </w:r>
     </w:p>
     <w:sectPr>
-      <w:headerReference w:type="default" r:id="rId14"/>
+      <w:headerReference w:type="default" r:id="rId25"/>
       <w:pgSz w:w="11906" w:h="16838"/>
       <w:pgMar w:top="1440" w:right="1440" w:bottom="1440" w:left="1440" w:header="708" w:footer="708" w:gutter="0"/>
       <w:cols w:space="708"/>
@@ -1706,6 +3011,92 @@
     </w:lvl>
   </w:abstractNum>
   <w:abstractNum w:abstractNumId="1" w15:restartNumberingAfterBreak="0">
+    <w:nsid w:val="6772403C"/>
+    <w:multiLevelType w:val="hybridMultilevel"/>
+    <w:tmpl w:val="EEB097CC"/>
+    <w:lvl w:ilvl="0" w:tplc="2000000F">
+      <w:start w:val="1"/>
+      <w:numFmt w:val="decimal"/>
+      <w:lvlText w:val="%1."/>
+      <w:lvlJc w:val="left"/>
+      <w:pPr>
+        <w:ind w:left="360" w:hanging="360"/>
+      </w:pPr>
+    </w:lvl>
+    <w:lvl w:ilvl="1" w:tplc="20000019" w:tentative="1">
+      <w:start w:val="1"/>
+      <w:numFmt w:val="lowerLetter"/>
+      <w:lvlText w:val="%2."/>
+      <w:lvlJc w:val="left"/>
+      <w:pPr>
+        <w:ind w:left="1080" w:hanging="360"/>
+      </w:pPr>
+    </w:lvl>
+    <w:lvl w:ilvl="2" w:tplc="2000001B" w:tentative="1">
+      <w:start w:val="1"/>
+      <w:numFmt w:val="lowerRoman"/>
+      <w:lvlText w:val="%3."/>
+      <w:lvlJc w:val="right"/>
+      <w:pPr>
+        <w:ind w:left="1800" w:hanging="180"/>
+      </w:pPr>
+    </w:lvl>
+    <w:lvl w:ilvl="3" w:tplc="2000000F" w:tentative="1">
+      <w:start w:val="1"/>
+      <w:numFmt w:val="decimal"/>
+      <w:lvlText w:val="%4."/>
+      <w:lvlJc w:val="left"/>
+      <w:pPr>
+        <w:ind w:left="2520" w:hanging="360"/>
+      </w:pPr>
+    </w:lvl>
+    <w:lvl w:ilvl="4" w:tplc="20000019" w:tentative="1">
+      <w:start w:val="1"/>
+      <w:numFmt w:val="lowerLetter"/>
+      <w:lvlText w:val="%5."/>
+      <w:lvlJc w:val="left"/>
+      <w:pPr>
+        <w:ind w:left="3240" w:hanging="360"/>
+      </w:pPr>
+    </w:lvl>
+    <w:lvl w:ilvl="5" w:tplc="2000001B" w:tentative="1">
+      <w:start w:val="1"/>
+      <w:numFmt w:val="lowerRoman"/>
+      <w:lvlText w:val="%6."/>
+      <w:lvlJc w:val="right"/>
+      <w:pPr>
+        <w:ind w:left="3960" w:hanging="180"/>
+      </w:pPr>
+    </w:lvl>
+    <w:lvl w:ilvl="6" w:tplc="2000000F" w:tentative="1">
+      <w:start w:val="1"/>
+      <w:numFmt w:val="decimal"/>
+      <w:lvlText w:val="%7."/>
+      <w:lvlJc w:val="left"/>
+      <w:pPr>
+        <w:ind w:left="4680" w:hanging="360"/>
+      </w:pPr>
+    </w:lvl>
+    <w:lvl w:ilvl="7" w:tplc="20000019" w:tentative="1">
+      <w:start w:val="1"/>
+      <w:numFmt w:val="lowerLetter"/>
+      <w:lvlText w:val="%8."/>
+      <w:lvlJc w:val="left"/>
+      <w:pPr>
+        <w:ind w:left="5400" w:hanging="360"/>
+      </w:pPr>
+    </w:lvl>
+    <w:lvl w:ilvl="8" w:tplc="2000001B" w:tentative="1">
+      <w:start w:val="1"/>
+      <w:numFmt w:val="lowerRoman"/>
+      <w:lvlText w:val="%9."/>
+      <w:lvlJc w:val="right"/>
+      <w:pPr>
+        <w:ind w:left="6120" w:hanging="180"/>
+      </w:pPr>
+    </w:lvl>
+  </w:abstractNum>
+  <w:abstractNum w:abstractNumId="2" w15:restartNumberingAfterBreak="0">
     <w:nsid w:val="7E630318"/>
     <w:multiLevelType w:val="hybridMultilevel"/>
     <w:tmpl w:val="E0D6F924"/>
@@ -1819,10 +3210,13 @@
     </w:lvl>
   </w:abstractNum>
   <w:num w:numId="1" w16cid:durableId="1209222511">
-    <w:abstractNumId w:val="1"/>
+    <w:abstractNumId w:val="2"/>
   </w:num>
   <w:num w:numId="2" w16cid:durableId="795563262">
     <w:abstractNumId w:val="0"/>
+  </w:num>
+  <w:num w:numId="3" w16cid:durableId="1920360420">
+    <w:abstractNumId w:val="1"/>
   </w:num>
 </w:numbering>
 </file>

</xml_diff>